<commit_message>
render again after cosmetic modifications
</commit_message>
<xml_diff>
--- a/results/table_s2.docx
+++ b/results/table_s2.docx
@@ -49,7 +49,7 @@
           <w:sz w:val="24"/>
           <w:color w:val="333333"/>
         </w:rPr>
-        <w:t xml:space="preserve">Table S1: Largest Differences Between GHSL and WorldPop Estimates</w:t>
+        <w:t xml:space="preserve">Table S2: Largest Differences Between GHSL and WorldPop Estimates</w:t>
       </w:r>
     </w:p>
     <w:p>
@@ -174,20 +174,13 @@
               </w:rPr>
               <w:t xml:space="preserve">WorldPop</w:t>
             </w:r>
-          </w:p>
-          <w:p>
-            <w:pPr>
-              <w:spacing w:before="0" w:after="60"/>
-              <w:keepNext/>
-              <w:jc w:val="center"/>
-            </w:pPr>
-            <w:r>
-              <w:rPr>
-                <w:b w:val="true"/>
-                <w:rFonts w:ascii="Calibri" w:hAnsi="Calibri"/>
-                <w:sz w:val="20"/>
-              </w:rPr>
-              <w:t xml:space="preserve">Estimate</w:t>
+            \line 
+            <w:r>
+              <w:rPr>
+                <w:rFonts w:ascii="Calibri" w:hAnsi="Calibri"/>
+                <w:sz w:val="20"/>
+              </w:rPr>
+              <w:t xml:space="preserve">** Estimate**</w:t>
             </w:r>
           </w:p>
         </w:tc>
@@ -212,20 +205,13 @@
               </w:rPr>
               <w:t xml:space="preserve">GHSL</w:t>
             </w:r>
-          </w:p>
-          <w:p>
-            <w:pPr>
-              <w:spacing w:before="0" w:after="60"/>
-              <w:keepNext/>
-              <w:jc w:val="center"/>
-            </w:pPr>
-            <w:r>
-              <w:rPr>
-                <w:b w:val="true"/>
-                <w:rFonts w:ascii="Calibri" w:hAnsi="Calibri"/>
-                <w:sz w:val="20"/>
-              </w:rPr>
-              <w:t xml:space="preserve">Estimate</w:t>
+            \line 
+            <w:r>
+              <w:rPr>
+                <w:rFonts w:ascii="Calibri" w:hAnsi="Calibri"/>
+                <w:sz w:val="20"/>
+              </w:rPr>
+              <w:t xml:space="preserve">** Estimate**</w:t>
             </w:r>
           </w:p>
         </w:tc>
@@ -250,13 +236,7 @@
               </w:rPr>
               <w:t xml:space="preserve">Absolute</w:t>
             </w:r>
-          </w:p>
-          <w:p>
-            <w:pPr>
-              <w:spacing w:before="0" w:after="60"/>
-              <w:keepNext/>
-              <w:jc w:val="center"/>
-            </w:pPr>
+            \line 
             <w:r>
               <w:rPr>
                 <w:b w:val="true"/>
@@ -289,13 +269,14 @@
               </w:rPr>
               <w:t xml:space="preserve">Relative</w:t>
             </w:r>
-          </w:p>
-          <w:p>
-            <w:pPr>
-              <w:spacing w:before="0" w:after="60"/>
-              <w:keepNext/>
-              <w:jc w:val="center"/>
-            </w:pPr>
+            \line 
+            <w:r>
+              <w:rPr>
+                <w:rFonts w:ascii="Calibri" w:hAnsi="Calibri"/>
+                <w:sz w:val="20"/>
+              </w:rPr>
+              <w:t xml:space="preserve"> </w:t>
+            </w:r>
             <w:r>
               <w:rPr>
                 <w:b w:val="true"/>

</xml_diff>